<commit_message>
Complete contribution report and preserve CELL line endings
</commit_message>
<xml_diff>
--- a/Group_Contribution_Report.docx
+++ b/Group_Contribution_Report.docx
@@ -508,7 +508,7 @@
                 <w:b w:val="0"/>
                 <w:sz w:val="20"/>
               </w:rPr>
-              <w:t>reservations branch; 20ad7d9, 0e1e899, 5c7d672, 9a69001, 4957e2f, cddb60d, and 045f77c. Commit descriptions are listed on the next page.</w:t>
+              <w:t>reservations branch; 20ad7d9, 0e1e899, 5c7d672, 9a69001, 4957e2f, cddb60d, and 045f77c. Commit descriptions are listed later in this report.</w:t>
             </w:r>
           </w:p>
         </w:tc>
@@ -679,6 +679,58 @@
         <w:pStyle w:val="Heading1"/>
       </w:pPr>
       <w:r>
+        <w:t>Individual contributions</w:t>
+      </w:r>
+    </w:p>
+    <w:p>
+      <w:pPr>
+        <w:pStyle w:val="Heading2"/>
+      </w:pPr>
+      <w:r>
+        <w:t>Favour Oviosa</w:t>
+      </w:r>
+    </w:p>
+    <w:p>
+      <w:r>
+        <w:t>Favour developed the resource and waiting-list components and the three live reports. She connected utilization and most requested results to countReservationsForResource, included resources with zero counts and all maximum-count ties, and counted distinct waiting students separately from date requests. She corrected availability and promotion to match both resource and date, preserved FIFO among eligible requests, and prevented duplicate waiting entries. She ran the independent and combined tests on CELL, resolved the main menu merge using the tested source, restored startup data loading, and organized the README, complexity notes, testing records, and group report. Her report changes are recorded in ed97fbb and PR 2; the combined merge is 9a2704d with parents ed97fbb and 8166b01.</w:t>
+      </w:r>
+    </w:p>
+    <w:p>
+      <w:pPr>
+        <w:pStyle w:val="Heading2"/>
+      </w:pPr>
+      <w:r>
+        <w:t>Ken Parbat Thapa</w:t>
+      </w:r>
+    </w:p>
+    <w:p>
+      <w:r>
+        <w:t>Ken maintained the single active-reservation linked list and implemented the manual linear search and stable merge sort used by the menu. He added the resource count function used by Favour's reports, sample reservation data, reservation-file loading, calendar-date normalization, resource validation, and search and sort menu integration. His tests check empty lists, equal-date order, sorting across months and years, counts after removal and restoration, valid loading, and rejection of invalid rows and conflicts. He reported testing reservation commit cddb60d on cell16-cse and shared the reservations branch commit sequence for integration.</w:t>
+      </w:r>
+    </w:p>
+    <w:p>
+      <w:pPr>
+        <w:pStyle w:val="Heading2"/>
+      </w:pPr>
+      <w:r>
+        <w:t>Ademola D</w:t>
+      </w:r>
+    </w:p>
+    <w:p>
+      <w:r>
+        <w:t>Ademola implemented the cancellation-history stack and integrated the system through the menu. His 8166b01 update made undo inspect the most recent record before attempting restoration, reject an occupied resource and date or reused reservation ID, and keep the record until restoration succeeds. He added trimmed input, whole-number menu validation, date retry and cancellation, explicit error messages, EOF handling, and menu entries for the final reports, searching, sorting, and loading. The combined integration retained these handlers and supplied their reservation, resource-report, and waiting-list dependencies. The final CELL run exercised both blocked and successful restores, FIFO promotion, invalid input, and live report updates.</w:t>
+      </w:r>
+    </w:p>
+    <w:p>
+      <w:r>
+        <w:br w:type="page"/>
+      </w:r>
+    </w:p>
+    <w:p>
+      <w:pPr>
+        <w:pStyle w:val="Heading1"/>
+      </w:pPr>
+      <w:r>
         <w:t>GitHub references and verification</w:t>
       </w:r>
     </w:p>
@@ -690,6 +742,11 @@
     <w:p>
       <w:r>
         <w:t>Favour report integration: https://github.com/Rayne-leg/Campus-Resource-Reservation-System/pull/2</w:t>
+      </w:r>
+    </w:p>
+    <w:p>
+      <w:r>
+        <w:t>Combined merge: 9a2704d27ec3be4f3c2fd2287c4e547667f54a53; parents ed97fbb and 8166b01. Favour pushed this merge to main on October 11, 2026.</w:t>
       </w:r>
     </w:p>
     <w:p>

</xml_diff>